<commit_message>
Number display equations by tab stops (ADR 0004)
Every display formula becomes its own paragraph of the new Equation
style: a centre tab, the formula as inline OMML, a right tab and the
number from the .aux (or \tag). aligned/gathered blocks with several
numbers are split one line per paragraph. Paragraphs are split around
display math, including math pandoc hides inside the Emph of a plain
theorem body.

reference.docx now sets A4 with 2.5 cm margins and carries the Equation
style with tab stops computed from the text width. normalize rewrites
alignat/flalign into align, which pandoc handles.

Co-Authored-By: Claude Fable 5.1 <noreply@anthropic.com>
Claude-Session: https://claude.ai/code/session_01LPGNxq9AMwXEvGL5ZGZ6wU
</commit_message>
<xml_diff>
--- a/src/tex2docx/data/reference.docx
+++ b/src/tex2docx/data/reference.docx
@@ -382,7 +382,10 @@
 </w:t>
       </w:r>
     </w:p>
-    <w:sectPr/>
+    <w:sectPr>
+      <w:pgSz w:w="11906" w:h="16838"/>
+      <w:pgMar w:left="1417" w:right="1417" w:top="1417" w:bottom="1417"/>
+    </w:sectPr>
   </w:body>
 </w:document>
 </file>
@@ -1068,6 +1071,19 @@
     <w:pPr>
       <w:keepLines/>
       <w:spacing w:before="60" w:after="120"/>
+    </w:pPr>
+  </w:style>
+  <w:style w:type="paragraph" w:customStyle="1" w:styleId="Equation">
+    <w:name w:val="Equation"/>
+    <w:basedOn w:val="BodyText"/>
+    <w:pPr>
+      <w:keepLines/>
+      <w:tabs>
+        <w:tab w:pos="4535" w:val="center"/>
+        <w:tab w:pos="9071" w:val="right"/>
+      </w:tabs>
+      <w:spacing w:before="120" w:after="120"/>
+      <w:ind w:firstLine="0" w:left="0"/>
     </w:pPr>
   </w:style>
 </w:styles>

</xml_diff>

<commit_message>
Template profiles: profile "standard" (Times New Roman 14, 1.5, black headings)
scripts/make_reference_docx.py builds every profile of PROFILES into its
own reference docx; "standard" sets Times New Roman 14 pt for all body
and heading styles, zero paragraph spacing, 1.5 line spacing and black
headings. Selected with config `profile: standard` or --profile. Corpus
case standard checks the resulting styles (expect.yaml key `template`).

Co-Authored-By: Claude Fable 5.1 <noreply@anthropic.com>
Claude-Session: https://claude.ai/code/session_01LPGNxq9AMwXEvGL5ZGZ6wU
</commit_message>
<xml_diff>
--- a/src/tex2docx/data/reference.docx
+++ b/src/tex2docx/data/reference.docx
@@ -565,7 +565,7 @@
     <w:name w:val="Normal"/>
     <w:qFormat/>
     <w:rPr>
-      <w:rFonts w:ascii="Times New Roman" w:hAnsi="Times New Roman"/>
+      <w:rFonts w:ascii="Times New Roman" w:hAnsi="Times New Roman" w:eastAsia="Times New Roman" w:cs="Times New Roman"/>
       <w:sz w:val="24"/>
     </w:rPr>
   </w:style>
@@ -578,7 +578,7 @@
     </w:pPr>
     <w:qFormat/>
     <w:rPr>
-      <w:rFonts w:ascii="Times New Roman" w:hAnsi="Times New Roman"/>
+      <w:rFonts w:ascii="Times New Roman" w:hAnsi="Times New Roman" w:eastAsia="Times New Roman" w:cs="Times New Roman"/>
       <w:sz w:val="24"/>
     </w:rPr>
   </w:style>
@@ -588,7 +588,7 @@
     <w:next w:val="BodyText"/>
     <w:qFormat/>
     <w:rPr>
-      <w:rFonts w:ascii="Times New Roman" w:hAnsi="Times New Roman"/>
+      <w:rFonts w:ascii="Times New Roman" w:hAnsi="Times New Roman" w:eastAsia="Times New Roman" w:cs="Times New Roman"/>
       <w:sz w:val="24"/>
     </w:rPr>
   </w:style>
@@ -600,7 +600,7 @@
       <w:spacing w:before="36" w:after="36"/>
     </w:pPr>
     <w:rPr>
-      <w:rFonts w:ascii="Times New Roman" w:hAnsi="Times New Roman"/>
+      <w:rFonts w:ascii="Times New Roman" w:hAnsi="Times New Roman" w:eastAsia="Times New Roman" w:cs="Times New Roman"/>
       <w:sz w:val="24"/>
     </w:rPr>
   </w:style>
@@ -616,11 +616,11 @@
       <w:jc w:val="center"/>
     </w:pPr>
     <w:rPr>
-      <w:rFonts w:asciiTheme="majorHAnsi" w:eastAsiaTheme="majorEastAsia" w:hAnsiTheme="majorHAnsi" w:cstheme="majorBidi"/>
+      <w:rFonts w:asciiTheme="majorHAnsi" w:eastAsiaTheme="majorEastAsia" w:hAnsiTheme="majorHAnsi" w:cstheme="majorBidi" w:ascii="Times New Roman" w:hAnsi="Times New Roman" w:eastAsia="Times New Roman" w:cs="Times New Roman"/>
       <w:b/>
       <w:bCs/>
       <w:color w:val="345A8A" w:themeColor="accent1" w:themeShade="B5"/>
-      <w:sz w:val="36"/>
+      <w:sz w:val="24"/>
       <w:szCs w:val="36"/>
     </w:rPr>
   </w:style>
@@ -636,7 +636,9 @@
       <w:jc w:val="center"/>
     </w:pPr>
     <w:rPr>
-      <w:sz w:val="30"/>
+      <w:rFonts w:ascii="Times New Roman" w:hAnsi="Times New Roman" w:eastAsia="Times New Roman" w:cs="Times New Roman"/>
+      <w:b/>
+      <w:sz w:val="24"/>
       <w:szCs w:val="30"/>
     </w:rPr>
   </w:style>
@@ -649,6 +651,11 @@
       <w:keepLines/>
       <w:jc w:val="center"/>
     </w:pPr>
+    <w:rPr>
+      <w:rFonts w:ascii="Times New Roman" w:hAnsi="Times New Roman" w:eastAsia="Times New Roman" w:cs="Times New Roman"/>
+      <w:b/>
+      <w:sz w:val="24"/>
+    </w:rPr>
   </w:style>
   <w:style w:type="paragraph" w:styleId="Date">
     <w:name w:val="Date"/>
@@ -659,6 +666,11 @@
       <w:keepLines/>
       <w:jc w:val="center"/>
     </w:pPr>
+    <w:rPr>
+      <w:rFonts w:ascii="Times New Roman" w:hAnsi="Times New Roman" w:eastAsia="Times New Roman" w:cs="Times New Roman"/>
+      <w:b/>
+      <w:sz w:val="24"/>
+    </w:rPr>
   </w:style>
   <w:style w:type="paragraph" w:customStyle="1" w:styleId="AbstractTitle">
     <w:name w:val="Abstract Title"/>
@@ -672,8 +684,9 @@
       <w:spacing w:before="300" w:after="0"/>
     </w:pPr>
     <w:rPr>
-      <w:sz w:val="20"/>
+      <w:sz w:val="24"/>
       <w:szCs w:val="20"/>
+      <w:rFonts w:ascii="Times New Roman" w:hAnsi="Times New Roman" w:eastAsia="Times New Roman" w:cs="Times New Roman"/>
       <w:b/>
       <w:color w:val="345A8A"/>
       &gt;
@@ -690,7 +703,8 @@
       <w:spacing w:before="100" w:after="300"/>
     </w:pPr>
     <w:rPr>
-      <w:sz w:val="20"/>
+      <w:rFonts w:ascii="Times New Roman" w:hAnsi="Times New Roman" w:eastAsia="Times New Roman" w:cs="Times New Roman"/>
+      <w:sz w:val="24"/>
       <w:szCs w:val="20"/>
     </w:rPr>
   </w:style>
@@ -700,7 +714,10 @@
     <w:next w:val="Bibliography"/>
     <w:qFormat/>
     <w:pPr/>
-    <w:rPr/>
+    <w:rPr>
+      <w:rFonts w:ascii="Times New Roman" w:hAnsi="Times New Roman" w:eastAsia="Times New Roman" w:cs="Times New Roman"/>
+      <w:sz w:val="24"/>
+    </w:rPr>
   </w:style>
   <w:style w:type="paragraph" w:styleId="Heading1">
     <w:name w:val="Heading 1"/>
@@ -715,11 +732,11 @@
       <w:outlineLvl w:val="0"/>
     </w:pPr>
     <w:rPr>
-      <w:rFonts w:asciiTheme="majorHAnsi" w:eastAsiaTheme="majorEastAsia" w:hAnsiTheme="majorHAnsi" w:cstheme="majorBidi"/>
+      <w:rFonts w:asciiTheme="majorHAnsi" w:eastAsiaTheme="majorEastAsia" w:hAnsiTheme="majorHAnsi" w:cstheme="majorBidi" w:ascii="Times New Roman" w:hAnsi="Times New Roman" w:eastAsia="Times New Roman" w:cs="Times New Roman"/>
       <w:b/>
       <w:bCs/>
       <w:color w:val="4F81BD" w:themeColor="accent1"/>
-      <w:sz w:val="32"/>
+      <w:sz w:val="24"/>
       <w:szCs w:val="32"/>
     </w:rPr>
   </w:style>
@@ -737,11 +754,11 @@
       <w:outlineLvl w:val="1"/>
     </w:pPr>
     <w:rPr>
-      <w:rFonts w:asciiTheme="majorHAnsi" w:eastAsiaTheme="majorEastAsia" w:hAnsiTheme="majorHAnsi" w:cstheme="majorBidi"/>
+      <w:rFonts w:asciiTheme="majorHAnsi" w:eastAsiaTheme="majorEastAsia" w:hAnsiTheme="majorHAnsi" w:cstheme="majorBidi" w:ascii="Times New Roman" w:hAnsi="Times New Roman" w:eastAsia="Times New Roman" w:cs="Times New Roman"/>
       <w:b/>
       <w:bCs/>
       <w:color w:val="4F81BD" w:themeColor="accent1"/>
-      <w:sz w:val="28"/>
+      <w:sz w:val="24"/>
       <w:szCs w:val="28"/>
     </w:rPr>
   </w:style>
@@ -759,7 +776,7 @@
       <w:outlineLvl w:val="2"/>
     </w:pPr>
     <w:rPr>
-      <w:rFonts w:asciiTheme="majorHAnsi" w:eastAsiaTheme="majorEastAsia" w:hAnsiTheme="majorHAnsi" w:cstheme="majorBidi"/>
+      <w:rFonts w:asciiTheme="majorHAnsi" w:eastAsiaTheme="majorEastAsia" w:hAnsiTheme="majorHAnsi" w:cstheme="majorBidi" w:ascii="Times New Roman" w:hAnsi="Times New Roman" w:eastAsia="Times New Roman" w:cs="Times New Roman"/>
       <w:b/>
       <w:bCs/>
       <w:color w:val="4F81BD" w:themeColor="accent1"/>
@@ -781,8 +798,9 @@
       <w:outlineLvl w:val="3"/>
     </w:pPr>
     <w:rPr>
-      <w:rFonts w:asciiTheme="majorHAnsi" w:eastAsiaTheme="majorEastAsia" w:hAnsiTheme="majorHAnsi" w:cstheme="majorBidi"/>
+      <w:rFonts w:asciiTheme="majorHAnsi" w:eastAsiaTheme="majorEastAsia" w:hAnsiTheme="majorHAnsi" w:cstheme="majorBidi" w:ascii="Times New Roman" w:hAnsi="Times New Roman" w:eastAsia="Times New Roman" w:cs="Times New Roman"/>
       <w:i/>
+      <w:b/>
       <w:bCs/>
       <w:color w:val="4F81BD" w:themeColor="accent1"/>
       <w:sz w:val="24"/>
@@ -803,7 +821,8 @@
       <w:outlineLvl w:val="4"/>
     </w:pPr>
     <w:rPr>
-      <w:rFonts w:asciiTheme="majorHAnsi" w:eastAsiaTheme="majorEastAsia" w:hAnsiTheme="majorHAnsi" w:cstheme="majorBidi"/>
+      <w:rFonts w:asciiTheme="majorHAnsi" w:eastAsiaTheme="majorEastAsia" w:hAnsiTheme="majorHAnsi" w:cstheme="majorBidi" w:ascii="Times New Roman" w:hAnsi="Times New Roman" w:eastAsia="Times New Roman" w:cs="Times New Roman"/>
+      <w:b/>
       <w:iCs/>
       <w:color w:val="4F81BD" w:themeColor="accent1"/>
       <w:sz w:val="24"/>
@@ -824,7 +843,8 @@
       <w:outlineLvl w:val="5"/>
     </w:pPr>
     <w:rPr>
-      <w:rFonts w:asciiTheme="majorHAnsi" w:eastAsiaTheme="majorEastAsia" w:hAnsiTheme="majorHAnsi" w:cstheme="majorBidi"/>
+      <w:rFonts w:asciiTheme="majorHAnsi" w:eastAsiaTheme="majorEastAsia" w:hAnsiTheme="majorHAnsi" w:cstheme="majorBidi" w:ascii="Times New Roman" w:hAnsi="Times New Roman" w:eastAsia="Times New Roman" w:cs="Times New Roman"/>
+      <w:b/>
       <w:color w:val="4F81BD" w:themeColor="accent1"/>
       <w:sz w:val="24"/>
       <w:szCs w:val="24"/>
@@ -844,7 +864,8 @@
       <w:outlineLvl w:val="6"/>
     </w:pPr>
     <w:rPr>
-      <w:rFonts w:asciiTheme="majorHAnsi" w:eastAsiaTheme="majorEastAsia" w:hAnsiTheme="majorHAnsi" w:cstheme="majorBidi"/>
+      <w:rFonts w:asciiTheme="majorHAnsi" w:eastAsiaTheme="majorEastAsia" w:hAnsiTheme="majorHAnsi" w:cstheme="majorBidi" w:ascii="Times New Roman" w:hAnsi="Times New Roman" w:eastAsia="Times New Roman" w:cs="Times New Roman"/>
+      <w:b/>
       <w:color w:val="4F81BD" w:themeColor="accent1"/>
       <w:sz w:val="24"/>
       <w:szCs w:val="24"/>
@@ -864,7 +885,8 @@
       <w:outlineLvl w:val="7"/>
     </w:pPr>
     <w:rPr>
-      <w:rFonts w:asciiTheme="majorHAnsi" w:eastAsiaTheme="majorEastAsia" w:hAnsiTheme="majorHAnsi" w:cstheme="majorBidi"/>
+      <w:rFonts w:asciiTheme="majorHAnsi" w:eastAsiaTheme="majorEastAsia" w:hAnsiTheme="majorHAnsi" w:cstheme="majorBidi" w:ascii="Times New Roman" w:hAnsi="Times New Roman" w:eastAsia="Times New Roman" w:cs="Times New Roman"/>
+      <w:b/>
       <w:color w:val="4F81BD" w:themeColor="accent1"/>
       <w:sz w:val="24"/>
       <w:szCs w:val="24"/>
@@ -884,7 +906,8 @@
       <w:outlineLvl w:val="8"/>
     </w:pPr>
     <w:rPr>
-      <w:rFonts w:asciiTheme="majorHAnsi" w:eastAsiaTheme="majorEastAsia" w:hAnsiTheme="majorHAnsi" w:cstheme="majorBidi"/>
+      <w:rFonts w:asciiTheme="majorHAnsi" w:eastAsiaTheme="majorEastAsia" w:hAnsiTheme="majorHAnsi" w:cstheme="majorBidi" w:ascii="Times New Roman" w:hAnsi="Times New Roman" w:eastAsia="Times New Roman" w:cs="Times New Roman"/>
+      <w:b/>
       <w:color w:val="4F81BD" w:themeColor="accent1"/>
       <w:sz w:val="24"/>
       <w:szCs w:val="24"/>
@@ -901,6 +924,10 @@
       <w:spacing w:before="100" w:after="100"/>
       <w:ind w:firstLine="0" w:left="480" w:right="480"/>
     </w:pPr>
+    <w:rPr>
+      <w:rFonts w:ascii="Times New Roman" w:hAnsi="Times New Roman" w:eastAsia="Times New Roman" w:cs="Times New Roman"/>
+      <w:sz w:val="24"/>
+    </w:rPr>
   </w:style>
   <w:style w:type="paragraph" w:styleId="FootnoteText">
     <w:name w:val="Footnote Text"/>
@@ -909,6 +936,10 @@
     <w:uiPriority w:val="9"/>
     <w:unhideWhenUsed/>
     <w:qFormat/>
+    <w:rPr>
+      <w:rFonts w:ascii="Times New Roman" w:hAnsi="Times New Roman" w:eastAsia="Times New Roman" w:cs="Times New Roman"/>
+      <w:sz w:val="24"/>
+    </w:rPr>
   </w:style>
   <w:style w:type="character" w:default="1" w:styleId="DefaultParagraphFont">
     <w:name w:val="Default Paragraph Font"/>
@@ -956,7 +987,9 @@
       <w:spacing w:after="0"/>
     </w:pPr>
     <w:rPr>
+      <w:rFonts w:ascii="Times New Roman" w:hAnsi="Times New Roman" w:eastAsia="Times New Roman" w:cs="Times New Roman"/>
       <w:b/>
+      <w:sz w:val="24"/>
     </w:rPr>
   </w:style>
   <w:style w:type="paragraph" w:customStyle="1" w:styleId="Definition">
@@ -966,6 +999,10 @@
       <w:keepLines/>
       <w:spacing w:before="120" w:after="120"/>
     </w:pPr>
+    <w:rPr>
+      <w:rFonts w:ascii="Times New Roman" w:hAnsi="Times New Roman" w:eastAsia="Times New Roman" w:cs="Times New Roman"/>
+      <w:sz w:val="24"/>
+    </w:rPr>
   </w:style>
   <w:style w:type="paragraph" w:styleId="Caption">
     <w:name w:val="Caption"/>
@@ -975,7 +1012,9 @@
       <w:spacing w:before="0" w:after="120"/>
     </w:pPr>
     <w:rPr>
+      <w:rFonts w:ascii="Times New Roman" w:hAnsi="Times New Roman" w:eastAsia="Times New Roman" w:cs="Times New Roman"/>
       <w:i/>
+      <w:sz w:val="24"/>
     </w:rPr>
   </w:style>
   <w:style w:type="paragraph" w:customStyle="1" w:styleId="TableCaption">
@@ -984,10 +1023,18 @@
     <w:pPr>
       <w:keepNext/>
     </w:pPr>
+    <w:rPr>
+      <w:rFonts w:ascii="Times New Roman" w:hAnsi="Times New Roman" w:eastAsia="Times New Roman" w:cs="Times New Roman"/>
+      <w:sz w:val="24"/>
+    </w:rPr>
   </w:style>
   <w:style w:type="paragraph" w:customStyle="1" w:styleId="ImageCaption">
     <w:name w:val="Image Caption"/>
     <w:basedOn w:val="Caption"/>
+    <w:rPr>
+      <w:rFonts w:ascii="Times New Roman" w:hAnsi="Times New Roman" w:eastAsia="Times New Roman" w:cs="Times New Roman"/>
+      <w:sz w:val="24"/>
+    </w:rPr>
   </w:style>
   <w:style w:type="paragraph" w:customStyle="1" w:styleId="Figure">
     <w:name w:val="Figure"/>

</xml_diff>